<commit_message>
feat: Admin quản lý tài khoản giáo viên (tạo/khóa/đặt lại mật khẩu)
- backend: router /admin/teachers (require_admin), chỉ thao tác vai trò teacher
  (404 nếu dùng để sửa tài khoản admin khác); tạo, is_active toggle (không xóa
  cứng, đúng PRD 12), đặt lại mật khẩu; bắt IntegrityError khi trùng email thay
  vì pre-check để tránh race condition
- backend/tests: 8 test pytest (phân quyền 401/403, CRUD, trùng email 409,
  tài khoản bị khóa không login được, đặt lại mật khẩu có hiệu lực ngay,
  không sửa được tài khoản admin qua endpoint này)
- frontend: AdminTeachersPage nối API thật; Layout điều hướng theo vai trò
  (Admin thấy thêm mục "Quản lý tài khoản"); App.tsx chặn route phía client
  cho vai trò không phải admin
- docs: PRD lên v1.6, cập nhật DEVELOPMENT_PLAN/IMPLEMENTATION_NOTES theo
  tiến độ thực tế; làm rõ các khối Admin còn lại (kho kiến thức, dạng bài,
  thư viện hình ảnh, cấu hình AI) vẫn chờ RAG ở Giai đoạn 1D
</commit_message>
<xml_diff>
--- a/docs/product/ENGLISH_EXAM_AI_PRODUCT_REQUIREMENTS.vi.docx
+++ b/docs/product/ENGLISH_EXAM_AI_PRODUCT_REQUIREMENTS.vi.docx
@@ -6736,7 +6736,7 @@
                 <w:color w:val="172B4D"/>
                 <w:sz w:val="19"/>
               </w:rPr>
-              <w:t>FastAPI + SQLAlchemy + Alembic; auth, danh mục học thuật đã seed, `AIProvider`/`MockAIProvider`, Validation Engine, API đề thi đầy đủ (block, sinh câu, duyệt, mã đề, xuất DOCX), 25 test pytest</w:t>
+              <w:t>FastAPI + SQLAlchemy + Alembic; auth, danh mục học thuật đã seed, `AIProvider`/`MockAIProvider`, Validation Engine, API đề thi đầy đủ (block, sinh câu, duyệt, mã đề, xuất DOCX), API Admin quản lý tài khoản giáo viên, 33 test pytest</w:t>
             </w:r>
           </w:p>
         </w:tc>
@@ -6787,7 +6787,7 @@
                 <w:color w:val="172B4D"/>
                 <w:sz w:val="19"/>
               </w:rPr>
-              <w:t>Vite + React + TypeScript strict + react-router; đăng nhập, Đề của tôi, Tạo đề, Duyệt câu hỏi, Xuất DOCX — nối API thật</w:t>
+              <w:t>Vite + React + TypeScript strict + react-router; đăng nhập, Đề của tôi, Tạo đề, Duyệt câu hỏi, Xuất DOCX, Quản lý tài khoản (Admin) — nối API thật, điều hướng theo vai trò</w:t>
             </w:r>
           </w:p>
         </w:tc>
@@ -8019,6 +8019,57 @@
           </w:p>
         </w:tc>
       </w:tr>
+      <w:tr>
+        <w:trPr>
+          <w:cantSplit/>
+        </w:trPr>
+        <w:tc>
+          <w:tcPr>
+            <w:tcW w:type="dxa" w:w="2438"/>
+            <w:tcMar>
+              <w:top w:w="80" w:type="dxa"/>
+              <w:start w:w="120" w:type="dxa"/>
+              <w:bottom w:w="80" w:type="dxa"/>
+              <w:end w:w="120" w:type="dxa"/>
+            </w:tcMar>
+            <w:vAlign w:val="center"/>
+          </w:tcPr>
+          <w:p>
+            <w:r>
+              <w:rPr>
+                <w:rFonts w:ascii="Aptos" w:hAnsi="Aptos" w:eastAsia="Aptos"/>
+                <w:b w:val="0"/>
+                <w:color w:val="172B4D"/>
+                <w:sz w:val="19"/>
+              </w:rPr>
+              <w:t>17</w:t>
+            </w:r>
+          </w:p>
+        </w:tc>
+        <w:tc>
+          <w:tcPr>
+            <w:tcW w:type="dxa" w:w="6973"/>
+            <w:tcMar>
+              <w:top w:w="80" w:type="dxa"/>
+              <w:start w:w="120" w:type="dxa"/>
+              <w:bottom w:w="80" w:type="dxa"/>
+              <w:end w:w="120" w:type="dxa"/>
+            </w:tcMar>
+            <w:vAlign w:val="center"/>
+          </w:tcPr>
+          <w:p>
+            <w:r>
+              <w:rPr>
+                <w:rFonts w:ascii="Aptos" w:hAnsi="Aptos" w:eastAsia="Aptos"/>
+                <w:b w:val="0"/>
+                <w:color w:val="172B4D"/>
+                <w:sz w:val="19"/>
+              </w:rPr>
+              <w:t>Admin quản lý tài khoản giáo viên: tạo, khóa/mở lại (không xóa cứng), đặt lại mật khẩu; chỉ áp dụng cho vai trò teacher, không dùng để quản trị tài khoản admin khác</w:t>
+            </w:r>
+          </w:p>
+        </w:tc>
+      </w:tr>
     </w:tbl>
     <w:p>
       <w:pPr>
@@ -8145,7 +8196,16 @@
           <w:rFonts w:ascii="Aptos" w:hAnsi="Aptos" w:eastAsia="Aptos"/>
           <w:sz w:val="22"/>
         </w:rPr>
-        <w:t xml:space="preserve">Còn thiếu để hoàn tất 1A+1B theo kế hoạch gốc: nhập tài liệu PDF/DOCX/text → trích xuất → full-text search (RAG, cố ý để sau — quyết định #15); số hóa fixture bank từ đề Unit 3 thật thành golden test tự động; kéo-thả thật và xem trước A4 động ở frontend (hiện dùng nút lên/xuống, chưa có preview); từ điển phát âm CMU và marker-heuristic theo thì. Bước kế tiếp: hoàn thiện các phần còn thiếu của 1A/1C hoặc </w:t>
+        <w:t>Admin quản lý tài khoản giáo viên (tạo, khóa/mở lại, đặt lại mật khẩu) đã có API + trang thật, kèm điều hướng phân theo vai trò ở frontend (Admin thấy thêm mục "Quản lý tài khoản", Giáo viên không thấy).</w:t>
+      </w:r>
+    </w:p>
+    <w:p>
+      <w:r>
+        <w:rPr>
+          <w:rFonts w:ascii="Aptos" w:hAnsi="Aptos" w:eastAsia="Aptos"/>
+          <w:sz w:val="22"/>
+        </w:rPr>
+        <w:t xml:space="preserve">Còn thiếu để hoàn tất 1A+1B+1C theo kế hoạch gốc: nhập tài liệu PDF/DOCX/text → trích xuất → full-text search (RAG, cố ý để sau — quyết định #15); màn hình Admin quản lý kho kiến thức/dạng bài/thư viện hình ảnh/cấu hình AI (mới làm phần tài khoản giáo viên, các khối quản trị khác trong prototype vẫn chỉ là ảnh tĩnh minh họa); số hóa fixture bank từ đề Unit 3 thật thành golden test tự động; kéo-thả thật và xem trước A4 động ở frontend (hiện dùng nút lên/xuống, chưa có preview); từ điển phát âm CMU và marker-heuristic theo thì; audit log. Bước kế tiếp: hoàn thiện các phần còn thiếu của 1A/1C hoặc </w:t>
       </w:r>
       <w:r>
         <w:rPr>

</xml_diff>